<commit_message>
sudah rapih semuanya editan
</commit_message>
<xml_diff>
--- a/templates/template_buku.docx
+++ b/templates/template_buku.docx
@@ -19,7 +19,7 @@
     <w:bookmarkEnd w:id="0"/>
     <w:p>
       <w:pPr>
-        <w:spacing w:after="0" w:line="360" w:lineRule="auto" w:before="0"/>
+        <w:spacing w:after="0" w:line="360" w:lineRule="auto"/>
         <w:jc w:val="center"/>
         <w:rPr>
           <w:rFonts w:ascii="Times New Roman" w:hAnsi="Times New Roman"/>
@@ -38,7 +38,7 @@
     </w:p>
     <w:p>
       <w:pPr>
-        <w:spacing w:after="0" w:line="360" w:lineRule="auto" w:before="2800"/>
+        <w:spacing w:before="2800" w:after="0" w:line="360" w:lineRule="auto"/>
         <w:jc w:val="center"/>
         <w:rPr>
           <w:rFonts w:ascii="Times New Roman" w:hAnsi="Times New Roman"/>
@@ -47,6 +47,7 @@
           <w:szCs w:val="60"/>
         </w:rPr>
       </w:pPr>
+      <w:proofErr w:type="spellStart"/>
       <w:r>
         <w:rPr>
           <w:rFonts w:ascii="Times New Roman" w:hAnsi="Times New Roman"/>
@@ -54,18 +55,96 @@
           <w:sz w:val="64"/>
           <w:szCs w:val="60"/>
         </w:rPr>
-        <w:t>Judul Naskah</w:t>
-      </w:r>
-    </w:p>
-    <w:p>
-      <w:pPr>
-        <w:rPr>
-          <w:rFonts w:ascii="Bookman Old Style" w:hAnsi="Bookman Old Style" w:cs="Calibri"/>
+        <w:t>Judul</w:t>
+      </w:r>
+      <w:proofErr w:type="spellEnd"/>
+      <w:r>
+        <w:rPr>
+          <w:rFonts w:ascii="Times New Roman" w:hAnsi="Times New Roman"/>
           <w:b/>
-          <w:sz w:val="20"/>
-          <w:szCs w:val="20"/>
-        </w:rPr>
-      </w:pPr>
+          <w:sz w:val="64"/>
+          <w:szCs w:val="60"/>
+        </w:rPr>
+        <w:t xml:space="preserve"> Naskah</w:t>
+      </w:r>
+    </w:p>
+    <w:p>
+      <w:pPr>
+        <w:rPr>
+          <w:rFonts w:ascii="Bookman Old Style" w:hAnsi="Bookman Old Style" w:cs="Calibri"/>
+          <w:b/>
+          <w:sz w:val="20"/>
+          <w:szCs w:val="20"/>
+        </w:rPr>
+      </w:pPr>
+      <w:r>
+        <w:rPr>
+          <w:rFonts w:ascii="Bookman Old Style" w:hAnsi="Bookman Old Style" w:cs="Calibri"/>
+          <w:noProof/>
+        </w:rPr>
+        <w:drawing>
+          <wp:anchor distT="0" distB="0" distL="114300" distR="114300" simplePos="0" relativeHeight="251662336" behindDoc="0" locked="0" layoutInCell="1" allowOverlap="1" wp14:anchorId="3E9B9454" wp14:editId="3B3CBAA3">
+            <wp:simplePos x="0" y="0"/>
+            <wp:positionH relativeFrom="margin">
+              <wp:align>center</wp:align>
+            </wp:positionH>
+            <wp:positionV relativeFrom="paragraph">
+              <wp:posOffset>1943100</wp:posOffset>
+            </wp:positionV>
+            <wp:extent cx="1560830" cy="362585"/>
+            <wp:effectExtent l="0" t="0" r="1270" b="0"/>
+            <wp:wrapNone/>
+            <wp:docPr id="3" name="Picture 3"/>
+            <wp:cNvGraphicFramePr>
+              <a:graphicFrameLocks xmlns:a="http://schemas.openxmlformats.org/drawingml/2006/main" noChangeAspect="1"/>
+            </wp:cNvGraphicFramePr>
+            <a:graphic xmlns:a="http://schemas.openxmlformats.org/drawingml/2006/main">
+              <a:graphicData uri="http://schemas.openxmlformats.org/drawingml/2006/picture">
+                <pic:pic xmlns:pic="http://schemas.openxmlformats.org/drawingml/2006/picture">
+                  <pic:nvPicPr>
+                    <pic:cNvPr id="0" name="Picture 1"/>
+                    <pic:cNvPicPr>
+                      <a:picLocks noChangeAspect="1" noChangeArrowheads="1"/>
+                    </pic:cNvPicPr>
+                  </pic:nvPicPr>
+                  <pic:blipFill>
+                    <a:blip r:embed="rId8">
+                      <a:extLst>
+                        <a:ext uri="{28A0092B-C50C-407E-A947-70E740481C1C}">
+                          <a14:useLocalDpi xmlns:a14="http://schemas.microsoft.com/office/drawing/2010/main" val="0"/>
+                        </a:ext>
+                      </a:extLst>
+                    </a:blip>
+                    <a:srcRect/>
+                    <a:stretch>
+                      <a:fillRect/>
+                    </a:stretch>
+                  </pic:blipFill>
+                  <pic:spPr bwMode="auto">
+                    <a:xfrm>
+                      <a:off x="0" y="0"/>
+                      <a:ext cx="1560830" cy="362585"/>
+                    </a:xfrm>
+                    <a:prstGeom prst="rect">
+                      <a:avLst/>
+                    </a:prstGeom>
+                    <a:noFill/>
+                    <a:ln>
+                      <a:noFill/>
+                    </a:ln>
+                  </pic:spPr>
+                </pic:pic>
+              </a:graphicData>
+            </a:graphic>
+            <wp14:sizeRelH relativeFrom="page">
+              <wp14:pctWidth>0</wp14:pctWidth>
+            </wp14:sizeRelH>
+            <wp14:sizeRelV relativeFrom="page">
+              <wp14:pctHeight>0</wp14:pctHeight>
+            </wp14:sizeRelV>
+          </wp:anchor>
+        </w:drawing>
+      </w:r>
       <w:r>
         <w:rPr>
           <w:rFonts w:ascii="Bookman Old Style" w:hAnsi="Bookman Old Style" w:cs="Calibri"/>
@@ -83,29 +162,18 @@
         <w:rPr>
           <w:rFonts w:ascii="Bookman Old Style" w:hAnsi="Bookman Old Style" w:cs="Calibri"/>
           <w:b/>
-          <w:sz w:val="32"/>
-          <w:szCs w:val="32"/>
-        </w:rPr>
-      </w:pPr>
-    </w:p>
-    <w:p>
-      <w:pPr>
-        <w:spacing w:after="0" w:line="360" w:lineRule="auto"/>
-        <w:jc w:val="center"/>
+          <w:sz w:val="20"/>
+          <w:szCs w:val="20"/>
+        </w:rPr>
+      </w:pPr>
+      <w:r>
         <w:rPr>
           <w:rFonts w:ascii="Bookman Old Style" w:hAnsi="Bookman Old Style" w:cs="Calibri"/>
           <w:b/>
           <w:sz w:val="20"/>
           <w:szCs w:val="20"/>
         </w:rPr>
-      </w:pPr>
-      <w:r>
-        <w:rPr>
-          <w:rFonts w:ascii="Bookman Old Style" w:hAnsi="Bookman Old Style" w:cs="Calibri"/>
-          <w:b/>
-          <w:sz w:val="20"/>
-          <w:szCs w:val="20"/>
-        </w:rPr>
+        <w:lastRenderedPageBreak/>
         <w:t>Judul Naskah</w:t>
       </w:r>
     </w:p>
@@ -697,30 +765,6 @@
           <w:szCs w:val="20"/>
           <w:lang w:val="en-ID"/>
         </w:rPr>
-        <w:br w:type="page"/>
-      </w:r>
-    </w:p>
-    <w:p>
-      <w:pPr>
-        <w:rPr>
-          <w:rFonts w:ascii="Bookman Old Style" w:hAnsi="Bookman Old Style" w:cs="Arabic Typesetting"/>
-          <w:b/>
-          <w:bCs/>
-          <w:sz w:val="20"/>
-          <w:szCs w:val="20"/>
-          <w:lang w:val="en-ID"/>
-        </w:rPr>
-      </w:pPr>
-      <w:r>
-        <w:rPr>
-          <w:rFonts w:ascii="Bookman Old Style" w:hAnsi="Bookman Old Style" w:cs="Arabic Typesetting"/>
-          <w:b/>
-          <w:bCs/>
-          <w:sz w:val="20"/>
-          <w:szCs w:val="20"/>
-          <w:lang w:val="en-ID"/>
-        </w:rPr>
-        <w:lastRenderedPageBreak/>
         <w:br w:type="page"/>
       </w:r>
     </w:p>
@@ -1177,7 +1221,6 @@
           <w:lang w:val="en-ID"/>
         </w:rPr>
         <w:lastRenderedPageBreak/>
-        <w:br w:type="page"/>
       </w:r>
     </w:p>
     <w:p>
@@ -1201,166 +1244,6 @@
           <w:lang w:val="en-ID"/>
         </w:rPr>
       </w:pPr>
-      <w:r>
-        <w:rPr>
-          <w:rFonts w:ascii="Bookman Old Style" w:hAnsi="Bookman Old Style" w:cs="Arabic Typesetting"/>
-          <w:noProof/>
-          <w:sz w:val="20"/>
-          <w:szCs w:val="20"/>
-          <w:lang w:val="en-ID"/>
-        </w:rPr>
-        <mc:AlternateContent>
-          <mc:Choice Requires="wpg">
-            <w:drawing>
-              <wp:anchor distT="0" distB="0" distL="114300" distR="114300" simplePos="0" relativeHeight="251661312" behindDoc="1" locked="0" layoutInCell="1" allowOverlap="1" wp14:anchorId="0F332397" wp14:editId="1E7B1238">
-                <wp:simplePos x="0" y="0"/>
-                <wp:positionH relativeFrom="column">
-                  <wp:posOffset>-20955</wp:posOffset>
-                </wp:positionH>
-                <wp:positionV relativeFrom="paragraph">
-                  <wp:posOffset>-124527</wp:posOffset>
-                </wp:positionV>
-                <wp:extent cx="3677313" cy="1029970"/>
-                <wp:effectExtent l="0" t="0" r="0" b="0"/>
-                <wp:wrapNone/>
-                <wp:docPr id="7" name="Group 7"/>
-                <wp:cNvGraphicFramePr/>
-                <a:graphic xmlns:a="http://schemas.openxmlformats.org/drawingml/2006/main">
-                  <a:graphicData uri="http://schemas.microsoft.com/office/word/2010/wordprocessingGroup">
-                    <wpg:wgp>
-                      <wpg:cNvGrpSpPr/>
-                      <wpg:grpSpPr>
-                        <a:xfrm>
-                          <a:off x="0" y="0"/>
-                          <a:ext cx="3677313" cy="1029970"/>
-                          <a:chOff x="0" y="0"/>
-                          <a:chExt cx="3677313" cy="1029970"/>
-                        </a:xfrm>
-                      </wpg:grpSpPr>
-                      <pic:pic xmlns:pic="http://schemas.openxmlformats.org/drawingml/2006/picture">
-                        <pic:nvPicPr>
-                          <pic:cNvPr id="6" name="Picture 6"/>
-                          <pic:cNvPicPr>
-                            <a:picLocks noChangeAspect="1"/>
-                          </pic:cNvPicPr>
-                        </pic:nvPicPr>
-                        <pic:blipFill rotWithShape="1">
-                          <a:blip r:embed="rId10" cstate="print">
-                            <a:extLst>
-                              <a:ext uri="{28A0092B-C50C-407E-A947-70E740481C1C}">
-                                <a14:useLocalDpi xmlns:a14="http://schemas.microsoft.com/office/drawing/2010/main" val="0"/>
-                              </a:ext>
-                            </a:extLst>
-                          </a:blip>
-                          <a:srcRect l="11341"/>
-                          <a:stretch/>
-                        </pic:blipFill>
-                        <pic:spPr bwMode="auto">
-                          <a:xfrm>
-                            <a:off x="0" y="103367"/>
-                            <a:ext cx="2730500" cy="922655"/>
-                          </a:xfrm>
-                          <a:prstGeom prst="rect">
-                            <a:avLst/>
-                          </a:prstGeom>
-                          <a:noFill/>
-                          <a:ln>
-                            <a:noFill/>
-                          </a:ln>
-                          <a:extLst>
-                            <a:ext uri="{53640926-AAD7-44D8-BBD7-CCE9431645EC}">
-                              <a14:shadowObscured xmlns:a14="http://schemas.microsoft.com/office/drawing/2010/main"/>
-                            </a:ext>
-                          </a:extLst>
-                        </pic:spPr>
-                      </pic:pic>
-                      <pic:pic xmlns:pic="http://schemas.openxmlformats.org/drawingml/2006/picture">
-                        <pic:nvPicPr>
-                          <pic:cNvPr id="5" name="Picture 5"/>
-                          <pic:cNvPicPr>
-                            <a:picLocks noChangeAspect="1"/>
-                          </pic:cNvPicPr>
-                        </pic:nvPicPr>
-                        <pic:blipFill rotWithShape="1">
-                          <a:blip r:embed="rId11" cstate="print">
-                            <a:extLst>
-                              <a:ext uri="{28A0092B-C50C-407E-A947-70E740481C1C}">
-                                <a14:useLocalDpi xmlns:a14="http://schemas.microsoft.com/office/drawing/2010/main" val="0"/>
-                              </a:ext>
-                            </a:extLst>
-                          </a:blip>
-                          <a:srcRect l="70550"/>
-                          <a:stretch/>
-                        </pic:blipFill>
-                        <pic:spPr bwMode="auto">
-                          <a:xfrm flipH="1">
-                            <a:off x="2667663" y="0"/>
-                            <a:ext cx="1009650" cy="1029970"/>
-                          </a:xfrm>
-                          <a:prstGeom prst="rect">
-                            <a:avLst/>
-                          </a:prstGeom>
-                          <a:noFill/>
-                          <a:ln>
-                            <a:noFill/>
-                          </a:ln>
-                          <a:extLst>
-                            <a:ext uri="{53640926-AAD7-44D8-BBD7-CCE9431645EC}">
-                              <a14:shadowObscured xmlns:a14="http://schemas.microsoft.com/office/drawing/2010/main"/>
-                            </a:ext>
-                          </a:extLst>
-                        </pic:spPr>
-                      </pic:pic>
-                    </wpg:wgp>
-                  </a:graphicData>
-                </a:graphic>
-              </wp:anchor>
-            </w:drawing>
-          </mc:Choice>
-          <mc:Fallback>
-            <w:pict>
-              <v:group w14:anchorId="334C68A9" id="Group 7" o:spid="_x0000_s1026" style="position:absolute;margin-left:-1.65pt;margin-top:-9.8pt;width:289.55pt;height:81.1pt;z-index:-251655168" coordsize="36773,10299" o:gfxdata="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">
-                <v:shapetype id="_x0000_t75" coordsize="21600,21600" o:spt="75" o:preferrelative="t" path="m@4@5l@4@11@9@11@9@5xe" filled="f" stroked="f">
-                  <v:stroke joinstyle="miter"/>
-                  <v:formulas>
-                    <v:f eqn="if lineDrawn pixelLineWidth 0"/>
-                    <v:f eqn="sum @0 1 0"/>
-                    <v:f eqn="sum 0 0 @1"/>
-                    <v:f eqn="prod @2 1 2"/>
-                    <v:f eqn="prod @3 21600 pixelWidth"/>
-                    <v:f eqn="prod @3 21600 pixelHeight"/>
-                    <v:f eqn="sum @0 0 1"/>
-                    <v:f eqn="prod @6 1 2"/>
-                    <v:f eqn="prod @7 21600 pixelWidth"/>
-                    <v:f eqn="sum @8 21600 0"/>
-                    <v:f eqn="prod @7 21600 pixelHeight"/>
-                    <v:f eqn="sum @10 21600 0"/>
-                  </v:formulas>
-                  <v:path o:extrusionok="f" gradientshapeok="t" o:connecttype="rect"/>
-                  <o:lock v:ext="edit" aspectratio="t"/>
-                </v:shapetype>
-                <v:shape id="Picture 6" o:spid="_x0000_s1027" type="#_x0000_t75" style="position:absolute;top:1033;width:27305;height:9227;visibility:visible;mso-wrap-style:square" o:gfxdata="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">
-                  <v:imagedata r:id="rId12" o:title="" cropleft="7432f"/>
-                </v:shape>
-                <v:shape id="Picture 5" o:spid="_x0000_s1028" type="#_x0000_t75" style="position:absolute;left:26676;width:10097;height:10299;flip:x;visibility:visible;mso-wrap-style:square" o:gfxdata="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">
-                  <v:imagedata r:id="rId13" o:title="" cropleft="46236f"/>
-                </v:shape>
-              </v:group>
-            </w:pict>
-          </mc:Fallback>
-        </mc:AlternateContent>
-      </w:r>
-    </w:p>
-    <w:p>
-      <w:pPr>
-        <w:pStyle w:val="2"/>
-      </w:pPr>
-      <w:r>
-        <w:t>Judul</w:t>
-      </w:r>
-      <w:r>
-        <w:t xml:space="preserve"> Bab</w:t>
-      </w:r>
     </w:p>
     <w:p>
       <w:pPr>
@@ -1375,36 +1258,7 @@
     <w:p>
       <w:pPr>
         <w:pStyle w:val="2"/>
-        <w:rPr>
-          <w:rFonts w:ascii="Bookman Old Style" w:hAnsi="Bookman Old Style"/>
-          <w:sz w:val="16"/>
-          <w:szCs w:val="16"/>
-        </w:rPr>
-      </w:pPr>
-    </w:p>
-    <w:p>
-      <w:pPr>
-        <w:pStyle w:val="2"/>
-        <w:rPr>
-          <w:rFonts w:ascii="Bookman Old Style" w:hAnsi="Bookman Old Style"/>
-          <w:sz w:val="16"/>
-          <w:szCs w:val="16"/>
-        </w:rPr>
-      </w:pPr>
-    </w:p>
-    <w:p>
-      <w:pPr>
-        <w:pStyle w:val="2"/>
-        <w:rPr>
-          <w:rFonts w:ascii="Bookman Old Style" w:hAnsi="Bookman Old Style"/>
-          <w:sz w:val="16"/>
-          <w:szCs w:val="16"/>
-        </w:rPr>
-      </w:pPr>
-    </w:p>
-    <w:p>
-      <w:pPr>
-        <w:pStyle w:val="2"/>
+        <w:ind w:firstLine="720"/>
         <w:jc w:val="left"/>
         <w:rPr>
           <w:rFonts w:ascii="Bookman Old Style" w:hAnsi="Bookman Old Style" w:cstheme="majorHAnsi"/>
@@ -1417,19 +1271,6 @@
           <w:szCs w:val="20"/>
         </w:rPr>
       </w:pPr>
-      <w:r>
-        <w:rPr>
-          <w:rFonts w:ascii="Bookman Old Style" w:hAnsi="Bookman Old Style" w:cstheme="majorHAnsi"/>
-          <w:b w:val="0"/>
-          <w:bCs w:val="0"/>
-          <w:i/>
-          <w:iCs/>
-          <w:color w:val="A6A6A6" w:themeColor="background1" w:themeShade="A6"/>
-          <w:sz w:val="20"/>
-          <w:szCs w:val="20"/>
-        </w:rPr>
-        <w:t>(Isi naskah)</w:t>
-      </w:r>
     </w:p>
     <w:p>
       <w:pPr>
@@ -1459,31 +1300,30 @@
           <w:lang w:val="en-ID"/>
         </w:rPr>
       </w:pPr>
-      <w:r>
+    </w:p>
+    <w:p>
+      <w:pPr>
+        <w:spacing w:after="80" w:line="336" w:lineRule="auto"/>
         <w:rPr>
           <w:rFonts w:ascii="Bookman Old Style" w:hAnsi="Bookman Old Style" w:cs="Arabic Typesetting"/>
           <w:sz w:val="20"/>
           <w:szCs w:val="20"/>
           <w:lang w:val="en-ID"/>
         </w:rPr>
-        <w:lastRenderedPageBreak/>
-        <w:br w:type="page"/>
-      </w:r>
-    </w:p>
-    <w:p>
-      <w:pPr>
-        <w:spacing w:after="80" w:line="336" w:lineRule="auto"/>
-        <w:rPr>
-          <w:rFonts w:ascii="Bookman Old Style" w:hAnsi="Bookman Old Style" w:cs="Arabic Typesetting"/>
-          <w:sz w:val="20"/>
-          <w:szCs w:val="20"/>
-          <w:lang w:val="en-ID"/>
-        </w:rPr>
-      </w:pPr>
+      </w:pPr>
+    </w:p>
+    <w:p>
+      <w:pPr>
+        <w:jc w:val="left"/>
+      </w:pPr>
+      <w:r>
+        <w:t>Judul Bab (Isi naskah)</w:t>
+      </w:r>
     </w:p>
     <w:p>
       <w:pPr>
         <w:pStyle w:val="1"/>
+        <w:pageBreakBefore/>
         <w:rPr>
           <w:lang w:val="en-ID"/>
         </w:rPr>
@@ -1508,231 +1348,12 @@
         </w:rPr>
       </w:pPr>
     </w:p>
-    <w:p>
-      <w:pPr>
-        <w:rPr>
-          <w:rFonts w:ascii="Bookman Old Style" w:hAnsi="Bookman Old Style" w:cs="Arabic Typesetting"/>
-          <w:b/>
-          <w:bCs/>
-          <w:sz w:val="20"/>
-          <w:szCs w:val="20"/>
-          <w:lang w:val="en-ID"/>
-        </w:rPr>
-      </w:pPr>
-      <w:r>
-        <w:rPr>
-          <w:rFonts w:ascii="Bookman Old Style" w:hAnsi="Bookman Old Style" w:cs="Arabic Typesetting"/>
-          <w:b/>
-          <w:bCs/>
-          <w:sz w:val="20"/>
-          <w:szCs w:val="20"/>
-          <w:lang w:val="en-ID"/>
-        </w:rPr>
-        <w:br w:type="page"/>
-      </w:r>
-    </w:p>
-    <w:p>
-      <w:pPr>
-        <w:spacing w:after="80" w:line="336" w:lineRule="auto"/>
-        <w:jc w:val="both"/>
-        <w:rPr>
-          <w:rFonts w:ascii="Bookman Old Style" w:hAnsi="Bookman Old Style" w:cs="Arabic Typesetting"/>
-          <w:b/>
-          <w:bCs/>
-          <w:sz w:val="20"/>
-          <w:szCs w:val="20"/>
-          <w:lang w:val="en-ID"/>
-        </w:rPr>
-      </w:pPr>
-    </w:p>
-    <w:p>
-      <w:pPr>
-        <w:spacing w:after="80" w:line="336" w:lineRule="auto"/>
-        <w:ind w:firstLine="567"/>
-        <w:jc w:val="both"/>
-        <w:rPr>
-          <w:rFonts w:ascii="Bookman Old Style" w:hAnsi="Bookman Old Style" w:cs="Arabic Typesetting"/>
-          <w:sz w:val="20"/>
-          <w:szCs w:val="20"/>
-          <w:lang w:val="en-ID"/>
-        </w:rPr>
-      </w:pPr>
-    </w:p>
-    <w:p>
-      <w:pPr>
-        <w:spacing w:after="80" w:line="336" w:lineRule="auto"/>
-        <w:ind w:firstLine="567"/>
-        <w:jc w:val="both"/>
-        <w:rPr>
-          <w:rFonts w:ascii="Bookman Old Style" w:hAnsi="Bookman Old Style" w:cs="Arabic Typesetting"/>
-          <w:sz w:val="20"/>
-          <w:szCs w:val="20"/>
-          <w:lang w:val="en-ID"/>
-        </w:rPr>
-      </w:pPr>
-    </w:p>
-    <w:p>
-      <w:pPr>
-        <w:spacing w:after="80" w:line="336" w:lineRule="auto"/>
-        <w:ind w:firstLine="567"/>
-        <w:jc w:val="both"/>
-        <w:rPr>
-          <w:rFonts w:ascii="Bookman Old Style" w:hAnsi="Bookman Old Style" w:cs="Arabic Typesetting"/>
-          <w:sz w:val="20"/>
-          <w:szCs w:val="20"/>
-          <w:lang w:val="en-ID"/>
-        </w:rPr>
-      </w:pPr>
-    </w:p>
-    <w:p>
-      <w:pPr>
-        <w:spacing w:after="80" w:line="336" w:lineRule="auto"/>
-        <w:ind w:firstLine="567"/>
-        <w:jc w:val="both"/>
-        <w:rPr>
-          <w:rFonts w:ascii="Bookman Old Style" w:hAnsi="Bookman Old Style" w:cs="Arabic Typesetting"/>
-          <w:sz w:val="20"/>
-          <w:szCs w:val="20"/>
-          <w:lang w:val="en-ID"/>
-        </w:rPr>
-      </w:pPr>
-    </w:p>
-    <w:p>
-      <w:pPr>
-        <w:spacing w:after="80" w:line="336" w:lineRule="auto"/>
-        <w:ind w:firstLine="567"/>
-        <w:jc w:val="both"/>
-        <w:rPr>
-          <w:rFonts w:ascii="Bookman Old Style" w:hAnsi="Bookman Old Style" w:cs="Arabic Typesetting"/>
-          <w:sz w:val="20"/>
-          <w:szCs w:val="20"/>
-          <w:lang w:val="en-ID"/>
-        </w:rPr>
-      </w:pPr>
-    </w:p>
-    <w:p>
-      <w:pPr>
-        <w:spacing w:after="80" w:line="336" w:lineRule="auto"/>
-        <w:ind w:firstLine="567"/>
-        <w:jc w:val="both"/>
-        <w:rPr>
-          <w:rFonts w:ascii="Bookman Old Style" w:hAnsi="Bookman Old Style" w:cs="Arabic Typesetting"/>
-          <w:sz w:val="20"/>
-          <w:szCs w:val="20"/>
-          <w:lang w:val="en-ID"/>
-        </w:rPr>
-      </w:pPr>
-    </w:p>
-    <w:p>
-      <w:pPr>
-        <w:spacing w:after="80" w:line="336" w:lineRule="auto"/>
-        <w:ind w:firstLine="567"/>
-        <w:jc w:val="both"/>
-        <w:rPr>
-          <w:rFonts w:ascii="Bookman Old Style" w:hAnsi="Bookman Old Style" w:cs="Arabic Typesetting"/>
-          <w:sz w:val="20"/>
-          <w:szCs w:val="20"/>
-          <w:lang w:val="en-ID"/>
-        </w:rPr>
-      </w:pPr>
-    </w:p>
-    <w:p>
-      <w:pPr>
-        <w:spacing w:after="80" w:line="336" w:lineRule="auto"/>
-        <w:ind w:firstLine="567"/>
-        <w:jc w:val="both"/>
-        <w:rPr>
-          <w:rFonts w:ascii="Bookman Old Style" w:hAnsi="Bookman Old Style" w:cs="Arabic Typesetting"/>
-          <w:sz w:val="20"/>
-          <w:szCs w:val="20"/>
-          <w:lang w:val="en-ID"/>
-        </w:rPr>
-      </w:pPr>
-    </w:p>
-    <w:p>
-      <w:pPr>
-        <w:spacing w:after="80" w:line="336" w:lineRule="auto"/>
-        <w:ind w:firstLine="567"/>
-        <w:jc w:val="both"/>
-        <w:rPr>
-          <w:rFonts w:ascii="Bookman Old Style" w:hAnsi="Bookman Old Style" w:cs="Arabic Typesetting"/>
-          <w:sz w:val="20"/>
-          <w:szCs w:val="20"/>
-          <w:lang w:val="en-ID"/>
-        </w:rPr>
-      </w:pPr>
-    </w:p>
-    <w:p>
-      <w:pPr>
-        <w:spacing w:after="80" w:line="336" w:lineRule="auto"/>
-        <w:ind w:firstLine="567"/>
-        <w:jc w:val="both"/>
-        <w:rPr>
-          <w:rFonts w:ascii="Bookman Old Style" w:hAnsi="Bookman Old Style" w:cs="Arabic Typesetting"/>
-          <w:sz w:val="20"/>
-          <w:szCs w:val="20"/>
-          <w:lang w:val="en-ID"/>
-        </w:rPr>
-      </w:pPr>
-    </w:p>
-    <w:p>
-      <w:pPr>
-        <w:spacing w:after="80" w:line="336" w:lineRule="auto"/>
-        <w:ind w:firstLine="567"/>
-        <w:jc w:val="both"/>
-        <w:rPr>
-          <w:rFonts w:ascii="Bookman Old Style" w:hAnsi="Bookman Old Style"/>
-          <w:sz w:val="20"/>
-          <w:szCs w:val="20"/>
-          <w:lang w:val="en-ID"/>
-        </w:rPr>
-      </w:pPr>
-    </w:p>
-    <w:p>
-      <w:pPr>
-        <w:spacing w:after="80" w:line="336" w:lineRule="auto"/>
-        <w:ind w:firstLine="567"/>
-        <w:jc w:val="both"/>
-        <w:rPr>
-          <w:rFonts w:ascii="Bookman Old Style" w:hAnsi="Bookman Old Style"/>
-          <w:sz w:val="20"/>
-          <w:szCs w:val="20"/>
-          <w:lang w:val="en-ID"/>
-        </w:rPr>
-      </w:pPr>
-    </w:p>
-    <w:p>
-      <w:pPr>
-        <w:spacing w:after="80" w:line="336" w:lineRule="auto"/>
-        <w:ind w:firstLine="567"/>
-        <w:jc w:val="both"/>
-        <w:rPr>
-          <w:rFonts w:ascii="Bookman Old Style" w:hAnsi="Bookman Old Style"/>
-          <w:sz w:val="20"/>
-          <w:szCs w:val="20"/>
-          <w:lang w:val="en-ID"/>
-        </w:rPr>
-      </w:pPr>
-    </w:p>
-    <w:p>
-      <w:pPr>
-        <w:spacing w:after="80" w:line="336" w:lineRule="auto"/>
-        <w:ind w:firstLine="567"/>
-        <w:jc w:val="both"/>
-        <w:rPr>
-          <w:rFonts w:ascii="Bookman Old Style" w:hAnsi="Bookman Old Style"/>
-          <w:sz w:val="20"/>
-          <w:szCs w:val="20"/>
-          <w:lang w:val="en-ID"/>
-        </w:rPr>
-      </w:pPr>
-    </w:p>
     <w:sectPr>
-      <w:headerReference w:type="even" r:id="rId14"/>
-      <w:headerReference w:type="default" r:id="rId15"/>
-      <w:footerReference w:type="even" r:id="rId16"/>
-      <w:footerReference w:type="default" r:id="rId17"/>
-      <w:footerReference w:type="first" r:id="rId20"/>
+      <w:headerReference w:type="even" r:id="rId10"/>
+      <w:headerReference w:type="default" r:id="rId11"/>
+      <w:footerReference w:type="even" r:id="rId12"/>
+      <w:footerReference w:type="default" r:id="rId13"/>
+      <w:footerReference w:type="first" r:id="rId14"/>
       <w:pgSz w:w="7938" w:h="11907" w:code="11"/>
       <w:pgMar w:top="1247" w:right="1021" w:bottom="1247" w:left="1247" w:header="964" w:footer="680" w:gutter="0"/>
       <w:cols w:space="708"/>
@@ -1929,67 +1550,12 @@
 </file>
 
 <file path=word/footer3.xml><?xml version="1.0" encoding="utf-8"?>
-<w:ftr xmlns:m="http://schemas.openxmlformats.org/officeDocument/2006/math" xmlns:mc="http://schemas.openxmlformats.org/markup-compatibility/2006" xmlns:mo="http://schemas.microsoft.com/office/mac/office/2008/main" xmlns:mv="urn:schemas-microsoft-com:mac:vml" xmlns:o="urn:schemas-microsoft-com:office:office" xmlns:r="http://schemas.openxmlformats.org/officeDocument/2006/relationships" xmlns:v="urn:schemas-microsoft-com:vml" xmlns:w10="urn:schemas-microsoft-com:office:word" xmlns:w14="http://schemas.microsoft.com/office/word/2010/wordml" xmlns:w="http://schemas.openxmlformats.org/wordprocessingml/2006/main" xmlns:wne="http://schemas.microsoft.com/office/word/2006/wordml" xmlns:wp14="http://schemas.microsoft.com/office/word/2010/wordprocessingDrawing" xmlns:wp="http://schemas.openxmlformats.org/drawingml/2006/wordprocessingDrawing" xmlns:wpc="http://schemas.microsoft.com/office/word/2010/wordprocessingCanvas" xmlns:wpg="http://schemas.microsoft.com/office/word/2010/wordprocessingGroup" xmlns:wpi="http://schemas.microsoft.com/office/word/2010/wordprocessingInk" xmlns:wps="http://schemas.microsoft.com/office/word/2010/wordprocessingShape" mc:Ignorable="w14 wp14">
+<w:ftr xmlns:wpc="http://schemas.microsoft.com/office/word/2010/wordprocessingCanvas" xmlns:cx="http://schemas.microsoft.com/office/drawing/2014/chartex" xmlns:cx1="http://schemas.microsoft.com/office/drawing/2015/9/8/chartex" xmlns:cx2="http://schemas.microsoft.com/office/drawing/2015/10/21/chartex" xmlns:cx3="http://schemas.microsoft.com/office/drawing/2016/5/9/chartex" xmlns:cx4="http://schemas.microsoft.com/office/drawing/2016/5/10/chartex" xmlns:cx5="http://schemas.microsoft.com/office/drawing/2016/5/11/chartex" xmlns:cx6="http://schemas.microsoft.com/office/drawing/2016/5/12/chartex" xmlns:cx7="http://schemas.microsoft.com/office/drawing/2016/5/13/chartex" xmlns:cx8="http://schemas.microsoft.com/office/drawing/2016/5/14/chartex" xmlns:mc="http://schemas.openxmlformats.org/markup-compatibility/2006" xmlns:aink="http://schemas.microsoft.com/office/drawing/2016/ink" xmlns:am3d="http://schemas.microsoft.com/office/drawing/2017/model3d" xmlns:o="urn:schemas-microsoft-com:office:office" xmlns:oel="http://schemas.microsoft.com/office/2019/extlst" xmlns:r="http://schemas.openxmlformats.org/officeDocument/2006/relationships" xmlns:m="http://schemas.openxmlformats.org/officeDocument/2006/math" xmlns:v="urn:schemas-microsoft-com:vml" xmlns:wp14="http://schemas.microsoft.com/office/word/2010/wordprocessingDrawing" xmlns:wp="http://schemas.openxmlformats.org/drawingml/2006/wordprocessingDrawing" xmlns:w10="urn:schemas-microsoft-com:office:word" xmlns:w="http://schemas.openxmlformats.org/wordprocessingml/2006/main" xmlns:w14="http://schemas.microsoft.com/office/word/2010/wordml" xmlns:w15="http://schemas.microsoft.com/office/word/2012/wordml" xmlns:w16cex="http://schemas.microsoft.com/office/word/2018/wordml/cex" xmlns:w16cid="http://schemas.microsoft.com/office/word/2016/wordml/cid" xmlns:w16="http://schemas.microsoft.com/office/word/2018/wordml" xmlns:w16du="http://schemas.microsoft.com/office/word/2023/wordml/word16du" xmlns:w16sdtdh="http://schemas.microsoft.com/office/word/2020/wordml/sdtdatahash" xmlns:w16sdtfl="http://schemas.microsoft.com/office/word/2024/wordml/sdtformatlock" xmlns:w16se="http://schemas.microsoft.com/office/word/2015/wordml/symex" xmlns:wpg="http://schemas.microsoft.com/office/word/2010/wordprocessingGroup" xmlns:wpi="http://schemas.microsoft.com/office/word/2010/wordprocessingInk" xmlns:wne="http://schemas.microsoft.com/office/word/2006/wordml" xmlns:wps="http://schemas.microsoft.com/office/word/2010/wordprocessingShape" mc:Ignorable="w14 w15 w16se w16cid w16 w16cex w16sdtdh w16sdtfl w16du wp14">
   <w:p>
     <w:pPr>
       <w:pStyle w:val="Footer"/>
       <w:jc w:val="center"/>
     </w:pPr>
-    <w:r/>
-    <w:r>
-      <w:rPr>
-        <w:rFonts w:ascii="Bookman Old Style" w:hAnsi="Bookman Old Style" w:cs="Calibri"/>
-        <w:noProof/>
-      </w:rPr>
-      <w:drawing>
-        <wp:inline distT="0" distB="0" distL="0" distR="0" wp14:anchorId="6E15CA0F" wp14:editId="0B7C2AB3">
-          <wp:extent cx="1560830" cy="362585"/>
-          <wp:effectExtent l="0" t="0" r="1270" b="0"/>
-          <wp:docPr id="3" name="Picture 3"/>
-          <wp:cNvGraphicFramePr>
-            <a:graphicFrameLocks xmlns:a="http://schemas.openxmlformats.org/drawingml/2006/main" noChangeAspect="1"/>
-          </wp:cNvGraphicFramePr>
-          <a:graphic xmlns:a="http://schemas.openxmlformats.org/drawingml/2006/main">
-            <a:graphicData uri="http://schemas.openxmlformats.org/drawingml/2006/picture">
-              <pic:pic xmlns:pic="http://schemas.openxmlformats.org/drawingml/2006/picture">
-                <pic:nvPicPr>
-                  <pic:cNvPr id="0" name="Picture 1"/>
-                  <pic:cNvPicPr>
-                    <a:picLocks noChangeAspect="1" noChangeArrowheads="1"/>
-                  </pic:cNvPicPr>
-                </pic:nvPicPr>
-                <pic:blipFill>
-                  <a:blip r:embed="rId1">
-                    <a:extLst>
-                      <a:ext uri="{28A0092B-C50C-407E-A947-70E740481C1C}">
-                        <a14:useLocalDpi xmlns:a14="http://schemas.microsoft.com/office/drawing/2010/main" val="0"/>
-                      </a:ext>
-                    </a:extLst>
-                  </a:blip>
-                  <a:srcRect/>
-                  <a:stretch>
-                    <a:fillRect/>
-                  </a:stretch>
-                </pic:blipFill>
-                <pic:spPr bwMode="auto">
-                  <a:xfrm>
-                    <a:off x="0" y="0"/>
-                    <a:ext cx="1560830" cy="362585"/>
-                  </a:xfrm>
-                  <a:prstGeom prst="rect">
-                    <a:avLst/>
-                  </a:prstGeom>
-                  <a:noFill/>
-                  <a:ln>
-                    <a:noFill/>
-                  </a:ln>
-                </pic:spPr>
-              </pic:pic>
-            </a:graphicData>
-          </a:graphic>
-        </wp:inline>
-      </w:drawing>
-    </w:r>
   </w:p>
 </w:ftr>
 </file>

</xml_diff>